<commit_message>
Add final report draft
</commit_message>
<xml_diff>
--- a/docs/IK-Report-1.docx
+++ b/docs/IK-Report-1.docx
@@ -113,7 +113,25 @@
           <w:sz w:val="20"/>
           <w:szCs w:val="20"/>
         </w:rPr>
-        <w:t>, Hilb Bokatov</w:t>
+        <w:t>, H</w:t>
+      </w:r>
+      <w:r>
+        <w:rPr>
+          <w:rFonts w:ascii="Helvetica" w:hAnsi="Helvetica"/>
+          <w:b/>
+          <w:sz w:val="20"/>
+          <w:szCs w:val="20"/>
+        </w:rPr>
+        <w:t>li</w:t>
+      </w:r>
+      <w:r>
+        <w:rPr>
+          <w:rFonts w:ascii="Helvetica" w:hAnsi="Helvetica"/>
+          <w:b/>
+          <w:sz w:val="20"/>
+          <w:szCs w:val="20"/>
+        </w:rPr>
+        <w:t>b Bokatov</w:t>
       </w:r>
       <w:r>
         <w:rPr>
@@ -995,19 +1013,53 @@
       </w:r>
       <w:r>
         <w:br/>
-        <w:t xml:space="preserve">Work on the Jacobian DLS solver required additional debugging. During this stage, Kuba Kałużniak identified </w:t>
+      </w:r>
+      <w:r>
+        <w:t>The</w:t>
+      </w:r>
+      <w:r>
+        <w:t xml:space="preserve"> DLS solver </w:t>
+      </w:r>
+      <w:r>
+        <w:t xml:space="preserve">was implemented next. Because the method maintains a Jacobian matrix of each joint, the robotic arm </w:t>
       </w:r>
       <w:r>
         <w:br/>
       </w:r>
       <w:r>
-        <w:t>an issue in the Jacobian calculations related to the cross-product terms used for joint axes. After correcting the formulation, the solver produced more accurate results and provided a better basis for future development.</w:t>
+        <w:t xml:space="preserve">is able to position itself relative to the target with the end effector facing the target. </w:t>
+      </w:r>
+      <w:r>
+        <w:t>This is a feature other solvers lack – their goal is</w:t>
+      </w:r>
+      <w:r>
+        <w:t xml:space="preserve"> </w:t>
+      </w:r>
+      <w:r>
+        <w:t>to reach the given position, regardless of the orientation</w:t>
+      </w:r>
+      <w:r>
+        <w:t>.</w:t>
       </w:r>
     </w:p>
     <w:p>
       <w:pPr>
         <w:pStyle w:val="PARA"/>
       </w:pPr>
+    </w:p>
+    <w:p>
+      <w:pPr>
+        <w:pStyle w:val="PARA"/>
+      </w:pPr>
+      <w:r>
+        <w:t xml:space="preserve">The 3D FABRIK solver took the team the most time and effort to complete. This algorithm operates purely on vectors, not taking into account angles between joints. The robotic arm constraints are evaluated after an unconstrained pass, adjusting </w:t>
+      </w:r>
+      <w:r>
+        <w:t xml:space="preserve">the joint position. While the arm presents limited </w:t>
+      </w:r>
+      <w:r>
+        <w:t>flexibility and does not reach the target, the key algorithm features have been included in the model.</w:t>
+      </w:r>
     </w:p>
     <w:p>
       <w:pPr>
@@ -1297,6 +1349,7 @@
         <w:pStyle w:val="PARA"/>
       </w:pPr>
       <w:r>
+        <w:lastRenderedPageBreak/>
         <w:t xml:space="preserve">We would also like to thank all members of the team for their commitment, cooperation, and continuous effort during </w:t>
       </w:r>
       <w:r>
@@ -1333,7 +1386,6 @@
         <w:jc w:val="both"/>
       </w:pPr>
       <w:r>
-        <w:lastRenderedPageBreak/>
         <w:t>REFERENCES</w:t>
       </w:r>
     </w:p>
@@ -2287,7 +2339,7 @@
   <w:abstractNum w:abstractNumId="12" w15:restartNumberingAfterBreak="0">
     <w:nsid w:val="3A877D64"/>
     <w:multiLevelType w:val="singleLevel"/>
-    <w:tmpl w:val="37E4B88C"/>
+    <w:tmpl w:val="C1E27C08"/>
     <w:lvl w:ilvl="0">
       <w:start w:val="1"/>
       <w:numFmt w:val="decimal"/>
@@ -2302,6 +2354,8 @@
       </w:pPr>
       <w:rPr>
         <w:i w:val="0"/>
+        <w:sz w:val="16"/>
+        <w:szCs w:val="16"/>
       </w:rPr>
     </w:lvl>
   </w:abstractNum>

</xml_diff>